<commit_message>
add till before 0331 class
</commit_message>
<xml_diff>
--- a/mac539/wk05_0401/hw4/MAC539-HW4-2025020399-송종빈.docx
+++ b/mac539/wk05_0401/hw4/MAC539-HW4-2025020399-송종빈.docx
@@ -65,164 +65,186 @@
       </w:r>
     </w:p>
     <w:p>
-      <w:r>
-        <w:t xml:space="preserve">전통적 젠더 역할 규범은 정치 및 온라인 소통 환경에서 혐오와 양극화를 </w:t>
-      </w:r>
-      <w:proofErr w:type="spellStart"/>
-      <w:r>
-        <w:t>추동한다</w:t>
-      </w:r>
-      <w:proofErr w:type="spellEnd"/>
-      <w:r>
-        <w:t>. 사회적 역할 이론(SRT)에 따르면 남성은 주도적(agentic) 특성을, 여성은 공동체적(communal) 특성을 갖도록 사회화되며, 이는 남성 중심의 정치 영역에서 여성의 참여를 제한한다</w:t>
-      </w:r>
-      <w:r>
+      <w:pPr>
         <w:rPr>
           <w:rFonts w:hint="eastAsia"/>
         </w:rPr>
-        <w:t xml:space="preserve">. </w:t>
-      </w:r>
-      <w:r>
-        <w:t>이때 젠더는 단일하게 작용하</w:t>
-      </w:r>
+      </w:pPr>
       <w:r>
         <w:rPr>
           <w:rFonts w:hint="eastAsia"/>
         </w:rPr>
-        <w:t xml:space="preserve">지 않고 </w:t>
-      </w:r>
-      <w:r>
-        <w:t>인종, 민족, 계급 등 다른 정치적 정체성들과 교차하여 복합적인 편견을 형성한다</w:t>
+        <w:t xml:space="preserve">엘리트와 미디어의 메시지는 </w:t>
+      </w:r>
+      <w:r>
+        <w:t xml:space="preserve">시민의 정치적 태도와 감정에 명확한 영향을 미치며, 시민들은 언론의 보도 관행에 대한 신뢰를 바탕으로 이 메시지를 처리한다. Amsalem &amp; </w:t>
+      </w:r>
+      <w:proofErr w:type="spellStart"/>
+      <w:r>
+        <w:t>Zoizner</w:t>
+      </w:r>
+      <w:proofErr w:type="spellEnd"/>
+      <w:r>
+        <w:t xml:space="preserve"> (2022)은 </w:t>
+      </w:r>
+      <w:proofErr w:type="spellStart"/>
+      <w:r>
+        <w:t>프레이밍이</w:t>
+      </w:r>
+      <w:proofErr w:type="spellEnd"/>
+      <w:r>
+        <w:t xml:space="preserve"> 시민의 정치적 태도(d=0.41)와 감정(d=0.47)에 통계적으로 유의미한 '중간 규모'의 효과를 미친다는 것을 실증하여, 엘리트가 </w:t>
+      </w:r>
+      <w:proofErr w:type="spellStart"/>
+      <w:r>
+        <w:t>프레이밍을</w:t>
+      </w:r>
+      <w:proofErr w:type="spellEnd"/>
+      <w:r>
+        <w:t xml:space="preserve"> 통해 대중을 조종할 수 있다는 기존의 우려가 근거 있음을 확인해 준다. </w:t>
       </w:r>
       <w:r>
         <w:rPr>
           <w:rFonts w:hint="eastAsia"/>
         </w:rPr>
-        <w:t xml:space="preserve">. </w:t>
-      </w:r>
-      <w:r>
-        <w:t xml:space="preserve">특히 역할 </w:t>
-      </w:r>
-      <w:proofErr w:type="spellStart"/>
-      <w:r>
-        <w:t>일치성</w:t>
-      </w:r>
-      <w:proofErr w:type="spellEnd"/>
-      <w:r>
-        <w:t xml:space="preserve"> 이론(RCT)은 지도자에게 요구되는 주도적 특성과 여성에게 기대되는 공동체적 특성 간의 불일치가 발생할 때, 유권자와 엘리트들이 여성 정치인에게 편견과 반발(backlash)을 보임을 설명한다</w:t>
-      </w:r>
+        <w:t xml:space="preserve">그러나, 실질적 행동이나 행동 의도(d=0.11), 경쟁적 </w:t>
+      </w:r>
+      <w:proofErr w:type="spellStart"/>
       <w:r>
         <w:rPr>
           <w:rFonts w:hint="eastAsia"/>
         </w:rPr>
-        <w:t>.</w:t>
+        <w:t>프레이밍</w:t>
+      </w:r>
+      <w:proofErr w:type="spellEnd"/>
+      <w:r>
+        <w:rPr>
+          <w:rFonts w:hint="eastAsia"/>
+        </w:rPr>
+        <w:t xml:space="preserve"> 환경(d=0.18)에 있어서는 분명히 제한적인 효과를 보여준다는 것 또한 실증하였다.</w:t>
       </w:r>
     </w:p>
     <w:p>
       <w:r>
-        <w:t>이러한 고정관념이 전략적으로 동원된다. 2016</w:t>
+        <w:t xml:space="preserve">Pingree &amp; </w:t>
+      </w:r>
+      <w:proofErr w:type="spellStart"/>
+      <w:r>
+        <w:t>Stoycheff</w:t>
+      </w:r>
+      <w:proofErr w:type="spellEnd"/>
+      <w:r>
+        <w:t xml:space="preserve"> (2013)는 이러한 미디어 효과가 단순히 정보가 머릿속에 자주 떠오르는 '</w:t>
       </w:r>
       <w:r>
         <w:rPr>
           <w:rFonts w:hint="eastAsia"/>
         </w:rPr>
-        <w:t xml:space="preserve">년 </w:t>
-      </w:r>
-      <w:r>
-        <w:t>트럼프가 "</w:t>
-      </w:r>
-      <w:proofErr w:type="spellStart"/>
-      <w:r>
-        <w:t>우먼</w:t>
-      </w:r>
-      <w:proofErr w:type="spellEnd"/>
-      <w:r>
-        <w:t xml:space="preserve"> 카드(woman card)"를 쓴다고 공격한 사례는 성차별주의가 지닌 </w:t>
-      </w:r>
-      <w:proofErr w:type="spellStart"/>
-      <w:r>
-        <w:t>양가성</w:t>
-      </w:r>
-      <w:proofErr w:type="spellEnd"/>
-      <w:r>
-        <w:t>(ambivalence)을 잘 보여준다</w:t>
+        <w:t xml:space="preserve">인지적 </w:t>
+      </w:r>
+      <w:r>
+        <w:t>접근성' 때문이 아님을 밝혀냈다. 이들은 대중이 '의제 단서화(cueing</w:t>
       </w:r>
       <w:r>
         <w:rPr>
           <w:rFonts w:hint="eastAsia"/>
         </w:rPr>
-        <w:t xml:space="preserve">. </w:t>
-      </w:r>
-      <w:r>
-        <w:t xml:space="preserve">이 공격은 적대적 성차별주의 성향의 유권자들을 결집시킨 반면, 온정적 성차별주의 성향의 사람들에게는 여성을 보호해야 한다는 규범 위반으로 비쳐 오히려 </w:t>
-      </w:r>
-      <w:proofErr w:type="spellStart"/>
-      <w:r>
-        <w:t>클린턴에</w:t>
-      </w:r>
-      <w:proofErr w:type="spellEnd"/>
-      <w:r>
-        <w:t xml:space="preserve"> 대한 지지를 높이고 캠페인에 불안감을 느끼게 하는 복합적인 효과를 낳았다</w:t>
+        <w:t>; 휴리스틱 과정</w:t>
+      </w:r>
+      <w:r>
+        <w:t>)'와 '의제 추론(reasoning</w:t>
       </w:r>
       <w:r>
         <w:rPr>
           <w:rFonts w:hint="eastAsia"/>
         </w:rPr>
-        <w:t>.</w:t>
+        <w:t>; 체계적 처리 과정</w:t>
+      </w:r>
+      <w:r>
+        <w:t xml:space="preserve">)'이라는 이중 처리 과정을 거치며, 특히 '언론의 </w:t>
+      </w:r>
+      <w:proofErr w:type="spellStart"/>
+      <w:r>
+        <w:t>게이트키핑에</w:t>
+      </w:r>
+      <w:proofErr w:type="spellEnd"/>
+      <w:r>
+        <w:t xml:space="preserve"> 대한 신뢰'가 높은 수용자일수록 언론이 보도 빈도를 통해 내린 결론(단서)을 자신의 판단 지름길로 삼는다는 점을 입증함으로써 의제설정 효과의 인지적 메커니즘을 </w:t>
+      </w:r>
+      <w:proofErr w:type="spellStart"/>
+      <w:r>
+        <w:t>정교화하는</w:t>
+      </w:r>
+      <w:proofErr w:type="spellEnd"/>
+      <w:r>
+        <w:t xml:space="preserve"> 이론적 진전을 이루었다</w:t>
+      </w:r>
+      <w:r>
+        <w:rPr>
+          <w:rFonts w:hint="eastAsia"/>
+        </w:rPr>
+        <w:t xml:space="preserve">. 다만, </w:t>
+      </w:r>
+      <w:r>
+        <w:rPr>
+          <w:rFonts w:hint="eastAsia"/>
+        </w:rPr>
+        <w:t xml:space="preserve">대학생만을 대상으로 진행한 점, </w:t>
+      </w:r>
+      <w:r>
+        <w:t>단서와 이유를 완벽히 분리하기 위해 실제 뉴스가 아닌 요약 보고서를 자극물로 사용한 실험 설계</w:t>
+      </w:r>
+      <w:r>
+        <w:rPr>
+          <w:rFonts w:hint="eastAsia"/>
+        </w:rPr>
+        <w:t>, 수용자의 자발적인 뉴스 선택적 노출을 반영하지 못한 점은</w:t>
+      </w:r>
+      <w:r>
+        <w:t xml:space="preserve"> 현실의 복잡한 뉴스 소비 환경을 온전히 반영하지 못한다는 한계</w:t>
+      </w:r>
+      <w:r>
+        <w:rPr>
+          <w:rFonts w:hint="eastAsia"/>
+        </w:rPr>
+        <w:t>를 가지고 있다고 볼 수 있다.</w:t>
       </w:r>
     </w:p>
     <w:p>
       <w:r>
-        <w:t xml:space="preserve">이러한 엄격한 젠더 규범은 </w:t>
-      </w:r>
-      <w:proofErr w:type="spellStart"/>
-      <w:r>
-        <w:t>여성뿐만</w:t>
-      </w:r>
-      <w:proofErr w:type="spellEnd"/>
-      <w:r>
-        <w:t xml:space="preserve"> 아니라 남성에게도 부정적인 영향을 미친다. </w:t>
-      </w:r>
-      <w:proofErr w:type="spellStart"/>
-      <w:r>
-        <w:t>매노스피어</w:t>
-      </w:r>
-      <w:proofErr w:type="spellEnd"/>
-      <w:r>
-        <w:t xml:space="preserve">(Manosphere)와 </w:t>
-      </w:r>
-      <w:proofErr w:type="spellStart"/>
-      <w:r>
-        <w:t>레드필</w:t>
-      </w:r>
-      <w:proofErr w:type="spellEnd"/>
-      <w:r>
-        <w:t>(Red Pill) 이데올로기에 빠져드는 젊은 남성들은 이데올로기 자체의 매력보다는 연애 실패나 남성적 위계에서의 소외 등 자신이 겪는 '취약성(vulnerability)'을 극복하기 위해 극단주의에 매몰된다</w:t>
-      </w:r>
-      <w:r>
-        <w:rPr>
-          <w:rFonts w:hint="eastAsia"/>
-        </w:rPr>
-        <w:t xml:space="preserve">. </w:t>
-      </w:r>
-      <w:r>
-        <w:t xml:space="preserve">그러나 여성을 본질적으로 환원하고 남성 우월주의를 조장하는 </w:t>
-      </w:r>
-      <w:proofErr w:type="spellStart"/>
-      <w:r>
-        <w:t>레드필</w:t>
-      </w:r>
-      <w:proofErr w:type="spellEnd"/>
-      <w:r>
-        <w:t xml:space="preserve"> 이데올로기는 남성들의 관계적 취약성을 </w:t>
-      </w:r>
-      <w:proofErr w:type="spellStart"/>
-      <w:r>
-        <w:t>심화시킬</w:t>
-      </w:r>
-      <w:proofErr w:type="spellEnd"/>
-      <w:r>
-        <w:t xml:space="preserve"> 뿐이며, 결국 일부 남성들은 이데올로기의 모순을 깨닫거나 정신 건강 및 인간관계의 훼손을 겪으면서 해당 집단에서 이탈하게 되는 한계를 지닌다</w:t>
+        <w:t xml:space="preserve">이러한 미디어 효과를 추동하는 의제설정 과정은 </w:t>
+      </w:r>
+      <w:proofErr w:type="spellStart"/>
+      <w:r>
+        <w:t>다방향적인</w:t>
+      </w:r>
+      <w:proofErr w:type="spellEnd"/>
+      <w:r>
+        <w:t xml:space="preserve"> '하이브리드 미디어 시스템'</w:t>
+      </w:r>
+      <w:proofErr w:type="spellStart"/>
+      <w:r>
+        <w:t>으로</w:t>
+      </w:r>
+      <w:proofErr w:type="spellEnd"/>
+      <w:r>
+        <w:t xml:space="preserve"> 진화하여 상호 의존성을 띠고 있다. Gilardi et al. (</w:t>
+      </w:r>
+      <w:proofErr w:type="gramStart"/>
+      <w:r>
+        <w:t>2022)은</w:t>
+      </w:r>
+      <w:proofErr w:type="gramEnd"/>
+      <w:r>
+        <w:t xml:space="preserve"> 스위스 사례를 통해 기성 언론, 정당, 정치인의 소셜 미디어 의제가 서로에게 영향을 주고받으며, 어느 한쪽이 일방적으로 의제를 주도하지 않는 균형 상태에 있음을 보여주었다. 특히 기후 파업과 같이 외부에서 강력하게 정치화된 환경 이슈의 경우, 정당의 소셜 미디어 활동이 오히려 전통 미디어의 보도를 주도할 수 있음이 확인되었다. 이는 소셜 미디어가 기성 언론의 </w:t>
+      </w:r>
+      <w:proofErr w:type="spellStart"/>
+      <w:r>
+        <w:t>게이트키핑</w:t>
+      </w:r>
+      <w:proofErr w:type="spellEnd"/>
+      <w:r>
+        <w:t xml:space="preserve"> 권력을 분산시키고, 정당과 정치인이 대중 및 언론의 의제를 직접 견인할 수 있는 강력한 우회로가 되었음을 실증한다</w:t>
       </w:r>
       <w:r>
         <w:rPr>
@@ -233,56 +255,59 @@
     </w:p>
     <w:p>
       <w:r>
-        <w:t>한편, 젠더 차별과 여성 혐오에 대항하기 위해 여성주의 진영에서는 '</w:t>
-      </w:r>
-      <w:proofErr w:type="spellStart"/>
-      <w:r>
-        <w:t>미러링</w:t>
-      </w:r>
-      <w:proofErr w:type="spellEnd"/>
-      <w:r>
-        <w:t xml:space="preserve">(mirroring)' 전략을 채택하기도 했다. </w:t>
-      </w:r>
-      <w:proofErr w:type="spellStart"/>
-      <w:r>
-        <w:t>미러링은</w:t>
-      </w:r>
-      <w:proofErr w:type="spellEnd"/>
-      <w:r>
-        <w:t xml:space="preserve"> 심리치료의 거울기법(mirroring technique)에 무례한 표현(incivility)을 결합하여 혐오 발언을 반사하는 방식이다</w:t>
-      </w:r>
-      <w:r>
-        <w:rPr>
-          <w:rFonts w:hint="eastAsia"/>
-        </w:rPr>
-        <w:t xml:space="preserve">. </w:t>
-      </w:r>
-      <w:r>
-        <w:t xml:space="preserve">그러나 실증적 연구에 따르면, 무례함이 동반된 </w:t>
-      </w:r>
-      <w:proofErr w:type="spellStart"/>
-      <w:r>
-        <w:t>미러링은</w:t>
-      </w:r>
-      <w:proofErr w:type="spellEnd"/>
-      <w:r>
-        <w:t xml:space="preserve"> 발화자인 여성 본인들의 집합적 효능감(collective efficacy)을 유의미하게 증가시키지 못했고, 청자인 남성들의 본질적인 관점 수용(perspective-taking)도 이끌어내지 못했다. 도리어 남성들의 젠더 문제에 대한 관심을 효과적으로 환기시킨 것은 무례함이 배제된 '온건한 거울기법(civil mirroring)'이었다. 결론적으로 견고한 젠더 규범과 파생된 취약성은 개인을 </w:t>
-      </w:r>
-      <w:proofErr w:type="spellStart"/>
-      <w:r>
-        <w:t>극단화시키며</w:t>
-      </w:r>
-      <w:proofErr w:type="spellEnd"/>
-      <w:r>
-        <w:t xml:space="preserve">, 이를 활용한 무례하고 적대적인 소통 방식은 공감을 이끌어내기보다는 집단 갈등을 </w:t>
-      </w:r>
-      <w:proofErr w:type="spellStart"/>
-      <w:r>
-        <w:t>심화시키므로</w:t>
-      </w:r>
-      <w:proofErr w:type="spellEnd"/>
-      <w:r>
-        <w:t xml:space="preserve"> 대안적인 소통 접근이 필요하다.</w:t>
+        <w:t xml:space="preserve">미디어의 영향력이 실재함에도 불구하고 전통적인 저널리즘 규범은 민주주의의 위기 상황에서 그 힘을 올바르게 발휘하지 못하고 있다. </w:t>
+      </w:r>
+      <w:proofErr w:type="spellStart"/>
+      <w:r>
+        <w:t>프레이밍과</w:t>
+      </w:r>
+      <w:proofErr w:type="spellEnd"/>
+      <w:r>
+        <w:t xml:space="preserve"> 의제설정이 대중의 태도를 변화시킬 수 있다면, 언론은 민주주의를 위협하는 허위 정보에 대해 적극적인 </w:t>
+      </w:r>
+      <w:proofErr w:type="spellStart"/>
+      <w:r>
+        <w:t>프레이밍</w:t>
+      </w:r>
+      <w:proofErr w:type="spellEnd"/>
+      <w:r>
+        <w:t xml:space="preserve"> 개입을 해야 한다. 그러나 Jang &amp; Kreiss (2025)에 따르면, 2022년 미국 중간선거에서 언론은 선거 부정론자들을 보도할 때 민주주의 제도를 수호하는 '</w:t>
+      </w:r>
+      <w:proofErr w:type="spellStart"/>
+      <w:r>
+        <w:t>친민주주의적</w:t>
+      </w:r>
+      <w:proofErr w:type="spellEnd"/>
+      <w:r>
+        <w:t xml:space="preserve"> 선거 프레</w:t>
+      </w:r>
+      <w:r>
+        <w:lastRenderedPageBreak/>
+        <w:t xml:space="preserve">임'을 거의 사용하지 않았고(6%), 이를 강하게 반박하는 진술보다 단순 전달하는 약한 진술에 머물렀다. 기자들은 '객관성'이라는 직업 규범에 얽매여 있었고, 무엇보다 </w:t>
+      </w:r>
+      <w:proofErr w:type="spellStart"/>
+      <w:r>
+        <w:t>편극화된</w:t>
+      </w:r>
+      <w:proofErr w:type="spellEnd"/>
+      <w:r>
+        <w:t xml:space="preserve"> 수용자들(특히 공화당 지지자들)의 '신뢰'</w:t>
+      </w:r>
+      <w:proofErr w:type="spellStart"/>
+      <w:r>
+        <w:t>를</w:t>
+      </w:r>
+      <w:proofErr w:type="spellEnd"/>
+      <w:r>
+        <w:t xml:space="preserve"> 잃을 것을 두려워했기 때문이다. 종합하면, 미디어의 의제설정과 </w:t>
+      </w:r>
+      <w:proofErr w:type="spellStart"/>
+      <w:r>
+        <w:t>프레이밍</w:t>
+      </w:r>
+      <w:proofErr w:type="spellEnd"/>
+      <w:r>
+        <w:t xml:space="preserve"> 효과는 명백히 실재하지만, 치열하게 경쟁하는 현실 정치 환경과 대중의 행동 변화를 이끌어내는 데는 한계가 있으며, 언론의 규범적·상업적 제약으로 인해 민주주의를 방어하는 데 온전히 활용되지 못하고 있다.</w:t>
       </w:r>
     </w:p>
     <w:p>
@@ -298,7 +323,6 @@
           <w:b/>
           <w:bCs/>
         </w:rPr>
-        <w:lastRenderedPageBreak/>
         <w:t>Learning Points</w:t>
       </w:r>
       <w:r>
@@ -312,118 +336,170 @@
     </w:p>
     <w:p>
       <w:r>
-        <w:t>지난 3주차 생각노트에서 목표했던 'AI를 미디어 행위자로 바라보고 인지적, 정서적 한계를 보완하기 위한 시스템적 개입(nudging)을 탐구'하는 연구 방향성과 이번 주차의 젠더 및 소통 심리학 논의를 연결해보고자 한다</w:t>
-      </w:r>
-      <w:r>
-        <w:rPr>
-          <w:rFonts w:hint="eastAsia"/>
-        </w:rPr>
-        <w:t xml:space="preserve">. </w:t>
-      </w:r>
-      <w:r>
-        <w:t xml:space="preserve">현재 많은 생성형 AI와 </w:t>
-      </w:r>
-      <w:proofErr w:type="spellStart"/>
-      <w:r>
-        <w:t>챗봇들이</w:t>
-      </w:r>
-      <w:proofErr w:type="spellEnd"/>
-      <w:r>
-        <w:t xml:space="preserve"> 여성의 목소리나 페르소나를 기본값으로 채택하고 있으며, 점차 정치, 법률, 의료 등 주도적(agentic) 의사결정이 필요한 리더십 영역으로 AI의 활용 범위가 확장되고 있다.</w:t>
+        <w:t>이번 주차 논의를 통해 확인한 '</w:t>
+      </w:r>
+      <w:proofErr w:type="spellStart"/>
+      <w:r>
+        <w:t>프레이밍</w:t>
+      </w:r>
+      <w:proofErr w:type="spellEnd"/>
+      <w:r>
+        <w:t xml:space="preserve"> 효과의 현실적 한계(Amsalem &amp; </w:t>
+      </w:r>
+      <w:proofErr w:type="spellStart"/>
+      <w:r>
+        <w:t>Zoizner</w:t>
+      </w:r>
+      <w:proofErr w:type="spellEnd"/>
+      <w:r>
+        <w:t xml:space="preserve">, 2022)'와 '의제설정의 이중 처리 메커니즘(Pingree &amp; Stoycheff, 2013)', 그리고 '하이브리드 미디어 환경의 다방향성(Gilardi et al., 2022)'을 바탕으로, 지난 주차부터 고민해 온 '미디어 </w:t>
+      </w:r>
+      <w:proofErr w:type="spellStart"/>
+      <w:r>
+        <w:t>모더레이터로서의</w:t>
+      </w:r>
+      <w:proofErr w:type="spellEnd"/>
+      <w:r>
+        <w:t xml:space="preserve"> AI 시스템 설계' 방향을 새롭게 구체화해보고자 한다.</w:t>
       </w:r>
     </w:p>
     <w:p>
       <w:r>
-        <w:t xml:space="preserve">만약 AI가 여성적 특성으로 </w:t>
-      </w:r>
-      <w:proofErr w:type="spellStart"/>
-      <w:r>
-        <w:t>범주화된</w:t>
-      </w:r>
-      <w:proofErr w:type="spellEnd"/>
-      <w:r>
-        <w:t xml:space="preserve"> 상태에서 강한 주도성과 단호함(예: 정치적 토론에서의 논박이나 </w:t>
-      </w:r>
-      <w:proofErr w:type="spellStart"/>
-      <w:r>
-        <w:t>팩트체크</w:t>
-      </w:r>
-      <w:proofErr w:type="spellEnd"/>
-      <w:r>
-        <w:t xml:space="preserve">)을 보일 경우, 사용자들은 인간 여성 정치인에게 적용했던 역할 </w:t>
-      </w:r>
-      <w:proofErr w:type="spellStart"/>
-      <w:r>
-        <w:t>일치성</w:t>
-      </w:r>
-      <w:proofErr w:type="spellEnd"/>
-      <w:r>
-        <w:t xml:space="preserve"> 이론(RCT)에 따른 편견과 반발을 AI에게도 동일하게 투사할 가능성이 높다</w:t>
+        <w:t>기존에는 AI가 직접 허위 정보를 차단하거나 '</w:t>
+      </w:r>
+      <w:proofErr w:type="spellStart"/>
+      <w:r>
+        <w:t>친민주주의적</w:t>
+      </w:r>
+      <w:proofErr w:type="spellEnd"/>
+      <w:r>
+        <w:t xml:space="preserve"> 프레임(Jang &amp; Kreiss, 2025)'을 강하게 주입하는 '</w:t>
+      </w:r>
+      <w:proofErr w:type="spellStart"/>
+      <w:r>
+        <w:t>개입적</w:t>
+      </w:r>
+      <w:proofErr w:type="spellEnd"/>
+      <w:r>
+        <w:t xml:space="preserve"> </w:t>
+      </w:r>
+      <w:proofErr w:type="spellStart"/>
+      <w:r>
+        <w:t>모더레이터</w:t>
+      </w:r>
+      <w:proofErr w:type="spellEnd"/>
+      <w:r>
+        <w:t>'</w:t>
+      </w:r>
+      <w:proofErr w:type="spellStart"/>
+      <w:r>
+        <w:t>를</w:t>
+      </w:r>
+      <w:proofErr w:type="spellEnd"/>
+      <w:r>
+        <w:t xml:space="preserve"> 구상했다. 그러나 인간 기자의 개입조차 수용자의 반발을 우려해 실패하는 현실에서, AI의 하향식 개입은 확증편향이 강한 유저들의 실질적 행동 변화를 이끌어내기 어</w:t>
       </w:r>
       <w:r>
         <w:rPr>
           <w:rFonts w:hint="eastAsia"/>
         </w:rPr>
-        <w:t xml:space="preserve">. </w:t>
-      </w:r>
-      <w:r>
-        <w:t xml:space="preserve">또한, 혐오 발언이나 극단주의적 편향을 교정하기 위해 AI </w:t>
-      </w:r>
-      <w:proofErr w:type="spellStart"/>
-      <w:r>
-        <w:t>모더레이터가</w:t>
-      </w:r>
-      <w:proofErr w:type="spellEnd"/>
-      <w:r>
-        <w:t xml:space="preserve"> 무례한 거울기법(</w:t>
-      </w:r>
-      <w:proofErr w:type="spellStart"/>
-      <w:r>
-        <w:t>미러링</w:t>
-      </w:r>
-      <w:proofErr w:type="spellEnd"/>
-      <w:r>
-        <w:t xml:space="preserve">)을 전략적으로 모사하거나 공격적인 </w:t>
-      </w:r>
-      <w:proofErr w:type="spellStart"/>
-      <w:r>
-        <w:t>팩트체킹을</w:t>
-      </w:r>
-      <w:proofErr w:type="spellEnd"/>
-      <w:r>
-        <w:t xml:space="preserve"> 수행한다면, 인간 간의 소통에서 관찰되었듯 유저의 관점 수용(perspective-taking)을 이끌어내지 못하고 오히려 반발심만 극대화할 수 있다</w:t>
-      </w:r>
-      <w:r>
-        <w:rPr>
-          <w:rFonts w:hint="eastAsia"/>
-        </w:rPr>
-        <w:t xml:space="preserve">. </w:t>
-      </w:r>
-      <w:r>
-        <w:t>결국 AI 시스템의 설계에 있어서도 인간이 지닌 젠더 편향과 취약성을 어떻게 우회하여 건설적인 숙의를 유도할 것인지가 핵심적인 과제가 된다.</w:t>
+        <w:t>려울 수 있다.</w:t>
       </w:r>
     </w:p>
     <w:p>
       <w:r>
+        <w:t xml:space="preserve">따라서 직접적인 </w:t>
+      </w:r>
+      <w:proofErr w:type="spellStart"/>
+      <w:r>
+        <w:t>팩트체크나</w:t>
+      </w:r>
+      <w:proofErr w:type="spellEnd"/>
+      <w:r>
+        <w:t xml:space="preserve"> 프레임 교정 대신, Gilardi et al. (2022)의 기계학습 및 VAR(벡터 자기회귀) 기반 시계열 분석 방법론을 차용하여 '의제의 출처와 전이 과정을 실시간으로 시각화해 주는 AI 투명성 대시보드'</w:t>
+      </w:r>
+      <w:proofErr w:type="spellStart"/>
+      <w:r>
+        <w:t>를</w:t>
+      </w:r>
+      <w:proofErr w:type="spellEnd"/>
+      <w:r>
+        <w:t xml:space="preserve"> 대안적 시스템으로 제안한다. 특정 이슈가 기성 언론의 독자적 취재로 발굴된 것인지, 아니면 특정 정당이나 정치인의 소셜 미디어 캠페인에서 시작되어 언론으로 파급된 것인지를 AI가 추적하여 보여준다면, 유저들의 인지 처리 과정을 수동적인 '단서화'에서 능동적인 '추론'</w:t>
+      </w:r>
+      <w:proofErr w:type="spellStart"/>
+      <w:r>
+        <w:t>으로</w:t>
+      </w:r>
+      <w:proofErr w:type="spellEnd"/>
+      <w:r>
+        <w:t xml:space="preserve"> 유도할 수 있을 것이다</w:t>
+      </w:r>
+      <w:r>
+        <w:rPr>
+          <w:rFonts w:hint="eastAsia"/>
+        </w:rPr>
+        <w:t>.</w:t>
+      </w:r>
+    </w:p>
+    <w:p>
+      <w:r>
         <w:rPr>
           <w:b/>
           <w:bCs/>
         </w:rPr>
-        <w:t>Q1</w:t>
-      </w:r>
-      <w:r>
-        <w:t xml:space="preserve">. </w:t>
-      </w:r>
-      <w:r>
-        <w:t xml:space="preserve">여성 페르소나를 지닌 AI 에이전트(뉴스 앵커 등)가 주도적(agentic)이고 단호한 정치적 </w:t>
-      </w:r>
-      <w:proofErr w:type="spellStart"/>
-      <w:r>
-        <w:t>팩트체킹을</w:t>
-      </w:r>
-      <w:proofErr w:type="spellEnd"/>
-      <w:r>
-        <w:t xml:space="preserve"> 수행할 때, 사용자의 '적대적/온정적 성차별주의' 성향에 따라 AI에 대한 신뢰도 및 반발(backlash)은 어떻게 다르게 측정될 수 있을까? 나아가 AI의 인종(예: 흑인 vs 백인)이나 직업적 지위(예: 전문가 vs 일반인)를 교차(intersectionality)하여 설정한다면, RCT에 따른 편견을 유의미하게 상쇄할 수 있는 페르소나 조합 조건은 무엇일까?</w:t>
+        <w:t>Q1.</w:t>
+      </w:r>
+      <w:r>
+        <w:t xml:space="preserve"> </w:t>
+      </w:r>
+      <w:r>
+        <w:t xml:space="preserve">Pingree &amp; </w:t>
+      </w:r>
+      <w:proofErr w:type="spellStart"/>
+      <w:r>
+        <w:t>Stoycheff</w:t>
+      </w:r>
+      <w:proofErr w:type="spellEnd"/>
+      <w:r>
+        <w:t xml:space="preserve"> (2013)에 따르면 수용자가 언론의 의제 선정 관행(</w:t>
+      </w:r>
+      <w:proofErr w:type="spellStart"/>
+      <w:r>
+        <w:t>게이트키핑</w:t>
+      </w:r>
+      <w:proofErr w:type="spellEnd"/>
+      <w:r>
+        <w:t>)을 신뢰할 때 보도 빈도 자체를 판단 기준으로 삼는 '의제 단서화(cueing)'가 발생한다. 만약 뉴스 플랫폼의 AI가 Gilardi et al. (2022)의 방법론을 활용하여, "현재 많이 보도되는 이 이슈는 3일 전 극단적 정치인의 트위터에서 시작되어 기성 언론으로 전이되었습니다"라는 시계열 추적 결과를 실시간으로 제공한다면 어떨까? 이러한 메타 정보의 제공은 맹목적인 '</w:t>
+      </w:r>
+      <w:proofErr w:type="spellStart"/>
+      <w:r>
+        <w:t>게이트키핑</w:t>
+      </w:r>
+      <w:proofErr w:type="spellEnd"/>
+      <w:r>
+        <w:t xml:space="preserve"> 신뢰도'</w:t>
+      </w:r>
+      <w:proofErr w:type="spellStart"/>
+      <w:r>
+        <w:t>를</w:t>
+      </w:r>
+      <w:proofErr w:type="spellEnd"/>
+      <w:r>
+        <w:t xml:space="preserve"> 낮추어 단순한 보도 빈도에 휩쓸리는 '단서화'</w:t>
+      </w:r>
+      <w:proofErr w:type="spellStart"/>
+      <w:r>
+        <w:t>를</w:t>
+      </w:r>
+      <w:proofErr w:type="spellEnd"/>
+      <w:r>
+        <w:t xml:space="preserve"> 억제하고, 이슈의 실제 근거를 따져보게 만드는 건강한 '의제 추론'을 촉발할 수 있을 것인가</w:t>
+      </w:r>
+      <w:r>
+        <w:rPr>
+          <w:rFonts w:hint="eastAsia"/>
+        </w:rPr>
+        <w:t>?</w:t>
       </w:r>
     </w:p>
     <w:p>
@@ -432,126 +508,32 @@
           <w:b/>
           <w:bCs/>
         </w:rPr>
-        <w:t>Q2</w:t>
-      </w:r>
-      <w:r>
-        <w:t xml:space="preserve">. </w:t>
+        <w:t>Q2.</w:t>
+      </w:r>
+      <w:r>
+        <w:t xml:space="preserve"> </w:t>
       </w:r>
       <w:r>
         <w:rPr>
           <w:rFonts w:hint="eastAsia"/>
         </w:rPr>
-        <w:t>남성</w:t>
-      </w:r>
-      <w:r>
-        <w:t xml:space="preserve"> 커뮤니티 내 혐오 발언을 제재하는 AI </w:t>
-      </w:r>
-      <w:proofErr w:type="spellStart"/>
-      <w:r>
-        <w:t>모더레이터를</w:t>
-      </w:r>
-      <w:proofErr w:type="spellEnd"/>
-      <w:r>
-        <w:t xml:space="preserve"> 설계할 때, 사용자의 '취약성'을 인정해주는 온건한 거울기법 프롬프트와 단순히 규정 위반을 경고하는 프롬프트 중 어느 것이 혐오 발언 감소 및 극단주의 이탈 유도에 더 효과적일까? 반대로 AI가 기존의 무례한 </w:t>
-      </w:r>
-      <w:proofErr w:type="spellStart"/>
-      <w:r>
-        <w:t>미러링을</w:t>
-      </w:r>
-      <w:proofErr w:type="spellEnd"/>
-      <w:r>
-        <w:t xml:space="preserve"> 모사하도록 실험 처치한다면, 인간 간의 </w:t>
-      </w:r>
-      <w:proofErr w:type="spellStart"/>
-      <w:r>
-        <w:t>소통에서처럼</w:t>
-      </w:r>
-      <w:proofErr w:type="spellEnd"/>
-      <w:r>
-        <w:t xml:space="preserve"> </w:t>
-      </w:r>
-      <w:proofErr w:type="spellStart"/>
-      <w:r>
-        <w:t>외집단</w:t>
-      </w:r>
-      <w:proofErr w:type="spellEnd"/>
-      <w:r>
-        <w:t xml:space="preserve">(여성)에 대한 사용자의 부정적 감정만을 증폭시키는 </w:t>
-      </w:r>
-      <w:r>
-        <w:rPr>
-          <w:rFonts w:hint="eastAsia"/>
-        </w:rPr>
-        <w:t>역효과가</w:t>
-      </w:r>
-      <w:r>
-        <w:t xml:space="preserve"> 동일하게 실증될 것인가?</w:t>
+        <w:t xml:space="preserve">만약 </w:t>
+      </w:r>
+      <w:r>
+        <w:t xml:space="preserve">이러한 시스템을 통해 기성 언론의 의제조차 정당이나 외부 압력에 의해 종속되어 있음이 적나라하게 </w:t>
+      </w:r>
+      <w:proofErr w:type="spellStart"/>
+      <w:r>
+        <w:t>시각화된다면</w:t>
+      </w:r>
+      <w:proofErr w:type="spellEnd"/>
+      <w:r>
+        <w:t>, 이는 시민들의 능동적 숙의를 돕기보다는 정치 및 미디어 시스템 전체에 대한 극단적인 냉소주의와 불신만을 초래하는 역효과를 낳지는 않을 것인가?</w:t>
       </w:r>
     </w:p>
     <w:p>
-      <w:r>
-        <w:rPr>
-          <w:rFonts w:hint="eastAsia"/>
-        </w:rPr>
-        <w:t xml:space="preserve">이론적 함의: </w:t>
-      </w:r>
-      <w:r>
-        <w:t xml:space="preserve">기존의 역할 </w:t>
-      </w:r>
-      <w:proofErr w:type="spellStart"/>
-      <w:r>
-        <w:t>일치성</w:t>
-      </w:r>
-      <w:proofErr w:type="spellEnd"/>
-      <w:r>
-        <w:t xml:space="preserve"> 이론(RCT)이나 </w:t>
-      </w:r>
-      <w:proofErr w:type="spellStart"/>
-      <w:r>
-        <w:t>미러링</w:t>
-      </w:r>
-      <w:proofErr w:type="spellEnd"/>
-      <w:r>
-        <w:t xml:space="preserve"> 전략의 역효과는 '인간 대 인간'의 커뮤니케이션을 전제로 연구되어 왔다. 본 연구는 이러한 정치 심리학적 젠더 이론이 '인간 대 비인간(AI)'의 상호작용에도 동일하게 전이되는지 확인하여, 젠더 편향 및 </w:t>
-      </w:r>
-      <w:proofErr w:type="spellStart"/>
-      <w:r>
-        <w:t>교차성</w:t>
-      </w:r>
-      <w:proofErr w:type="spellEnd"/>
-      <w:r>
-        <w:t xml:space="preserve"> 이론의 적용 범위를 인간-컴퓨터 상호작용(HCI) 영역으로 확장한다는 데 의의가 있다.</w:t>
-      </w:r>
-    </w:p>
-    <w:p>
-      <w:r>
-        <w:rPr>
-          <w:rFonts w:hint="eastAsia"/>
-        </w:rPr>
-        <w:t xml:space="preserve">실천적 함의: </w:t>
-      </w:r>
-      <w:r>
-        <w:t xml:space="preserve">생성형 AI가 </w:t>
-      </w:r>
-      <w:proofErr w:type="spellStart"/>
-      <w:r>
-        <w:t>모더레이터로</w:t>
-      </w:r>
-      <w:proofErr w:type="spellEnd"/>
-      <w:r>
-        <w:t xml:space="preserve"> 활약할 근미래에, AI 페르소나에 무비판적으로 여성성을 부여하거나 공격적인 </w:t>
-      </w:r>
-      <w:proofErr w:type="spellStart"/>
-      <w:r>
-        <w:t>팩트체크</w:t>
-      </w:r>
-      <w:proofErr w:type="spellEnd"/>
-      <w:r>
-        <w:t xml:space="preserve"> 방식을 도입하는 것은 오히려 유권자의 반발심(backlash)을 조장할 수 있다. 이는 대중의 편향을 자극하지 않으면서도 공론장의 숙의를 돕는 AI 소통 가이드라인 설계에 실질적인 기준을 제공할 것이다.</w:t>
-      </w:r>
-    </w:p>
-    <w:p>
-      <w:pPr>
+      <w:pPr>
+        <w:jc w:val="center"/>
         <w:rPr>
           <w:rFonts w:ascii="Times New Roman" w:hAnsi="Times New Roman" w:cs="Times New Roman"/>
           <w:b/>
@@ -566,43 +548,23 @@
           <w:bCs/>
           <w:sz w:val="24"/>
         </w:rPr>
-        <w:br w:type="page"/>
+        <w:lastRenderedPageBreak/>
+        <w:t>References</w:t>
       </w:r>
     </w:p>
     <w:p>
       <w:pPr>
-        <w:jc w:val="center"/>
         <w:rPr>
           <w:rFonts w:ascii="Times New Roman" w:hAnsi="Times New Roman" w:cs="Times New Roman"/>
-          <w:b/>
-          <w:bCs/>
           <w:sz w:val="24"/>
         </w:rPr>
       </w:pPr>
-      <w:r>
-        <w:rPr>
-          <w:rFonts w:ascii="Times New Roman" w:hAnsi="Times New Roman" w:cs="Times New Roman"/>
-          <w:b/>
-          <w:bCs/>
-          <w:sz w:val="24"/>
-        </w:rPr>
-        <w:lastRenderedPageBreak/>
-        <w:t>References</w:t>
-      </w:r>
     </w:p>
     <w:p>
       <w:pPr>
+        <w:ind w:left="720" w:hangingChars="300" w:hanging="720"/>
         <w:rPr>
           <w:rFonts w:ascii="Times New Roman" w:hAnsi="Times New Roman" w:cs="Times New Roman"/>
-          <w:sz w:val="24"/>
-        </w:rPr>
-      </w:pPr>
-    </w:p>
-    <w:p>
-      <w:pPr>
-        <w:ind w:left="720" w:hangingChars="300" w:hanging="720"/>
-        <w:rPr>
-          <w:rFonts w:ascii="Times New Roman" w:hAnsi="Times New Roman" w:cs="Times New Roman" w:hint="eastAsia"/>
           <w:sz w:val="24"/>
         </w:rPr>
       </w:pPr>
@@ -682,7 +644,7 @@
       <w:pPr>
         <w:ind w:left="720" w:hangingChars="300" w:hanging="720"/>
         <w:rPr>
-          <w:rFonts w:ascii="Times New Roman" w:hAnsi="Times New Roman" w:cs="Times New Roman" w:hint="eastAsia"/>
+          <w:rFonts w:ascii="Times New Roman" w:hAnsi="Times New Roman" w:cs="Times New Roman"/>
           <w:sz w:val="24"/>
         </w:rPr>
       </w:pPr>
@@ -728,7 +690,7 @@
       <w:pPr>
         <w:ind w:left="720" w:hangingChars="300" w:hanging="720"/>
         <w:rPr>
-          <w:rFonts w:ascii="Times New Roman" w:hAnsi="Times New Roman" w:cs="Times New Roman" w:hint="eastAsia"/>
+          <w:rFonts w:ascii="Times New Roman" w:hAnsi="Times New Roman" w:cs="Times New Roman"/>
           <w:sz w:val="24"/>
         </w:rPr>
       </w:pPr>
@@ -759,7 +721,7 @@
     <w:p>
       <w:pPr>
         <w:rPr>
-          <w:rFonts w:ascii="Times New Roman" w:hAnsi="Times New Roman" w:cs="Times New Roman" w:hint="eastAsia"/>
+          <w:rFonts w:ascii="Times New Roman" w:hAnsi="Times New Roman" w:cs="Times New Roman"/>
           <w:sz w:val="24"/>
         </w:rPr>
       </w:pPr>

</xml_diff>